<commit_message>
t9: rayas al estilo Chicago y bases ampliadas de Kenyon
Kenyon declara el Chicago Manual of Style: se cierran las 6 rayas que
llevaban espacios. Se anotan tambien el pago por palabra, la retencion
del copyright, la regla de retirada sin sustitucion y los contactos que
conviene marcar como seguros antes de subir nada.

Co-Authored-By: Claude Opus 5 <noreply@anthropic.com>
Claude-Session: https://claude.ai/code/session_01HSYkqQbxm73vex2RPsJzdT
</commit_message>
<xml_diff>
--- a/talleres/t9-envios/kenyon/The Receipt - Dennis Gamboa.docx
+++ b/talleres/t9-envios/kenyon/The Receipt - Dennis Gamboa.docx
@@ -134,7 +134,7 @@
         <w:jc w:val="left"/>
       </w:pPr>
       <w:r>
-        <w:t>What happened over the following twelve minutes would deserve the same attention as a movie heist. Darío moved through the supermarket the way one moves across a board known by heart: yesterday's bread at half price in the bin at the back, Tuesday's yogurts that expire on Sunday and get eaten on Friday, the ugly fruit in the bottom crate — which tastes the same and has simply had worse luck — two cans with crooked labels that nobody wants and that therefore cost less while containing the same. The basket filled without a single gesture of doubt. Darío did not doubt inside a supermarket. It was, probably, the only building in the world where he didn't.</w:t>
+        <w:t>What happened over the following twelve minutes would deserve the same attention as a movie heist. Darío moved through the supermarket the way one moves across a board known by heart: yesterday's bread at half price in the bin at the back, Tuesday's yogurts that expire on Sunday and get eaten on Friday, the ugly fruit in the bottom crate—which tastes the same and has simply had worse luck—two cans with crooked labels that nobody wants and that therefore cost less while containing the same. The basket filled without a single gesture of doubt. Darío did not doubt inside a supermarket. It was, probably, the only building in the world where he didn't.</w:t>
       </w:r>
     </w:p>
     <w:p>
@@ -164,7 +164,7 @@
         <w:jc w:val="left"/>
       </w:pPr>
       <w:r>
-        <w:t>Because nobody taught Darío how to live: they handed him the exam without the syllabus. At eighteen he landed alone in a city with a different accent, carrying one bag and no inherited instructions, and he passed as a free candidate. From that era he kept a way of walking — that of a man who calculates the exit of every place on entering it — and a certainty that was almost a religion: enduring is not a minor virtue. It is the virtue. The others can be bought later, on offer, when there's money.</w:t>
+        <w:t>Because nobody taught Darío how to live: they handed him the exam without the syllabus. At eighteen he landed alone in a city with a different accent, carrying one bag and no inherited instructions, and he passed as a free candidate. From that era he kept a way of walking—that of a man who calculates the exit of every place on entering it—and a certainty that was almost a religion: enduring is not a minor virtue. It is the virtue. The others can be bought later, on offer, when there's money.</w:t>
       </w:r>
     </w:p>
     <w:p>
@@ -184,7 +184,7 @@
         <w:jc w:val="left"/>
       </w:pPr>
       <w:r>
-        <w:t>The box was full of receipts. Years of receipts, ordered by date, packed tight as a card index. Other people keep photographs; for photographs you need someone willing to take them. A receipt needs nobody: it is proof that you were in a place, at an hour, and that you paid your share. That you happened. Darío's box was that. Not bookkeeping — memory. The complete biography of a man as told by a cash register, the only narrator in the world that doesn't embellish.</w:t>
+        <w:t>The box was full of receipts. Years of receipts, ordered by date, packed tight as a card index. Other people keep photographs; for photographs you need someone willing to take them. A receipt needs nobody: it is proof that you were in a place, at an hour, and that you paid your share. That you happened. Darío's box was that. Not bookkeeping—memory. The complete biography of a man as told by a cash register, the only narrator in the world that doesn't embellish.</w:t>
       </w:r>
     </w:p>
     <w:p>
@@ -204,7 +204,7 @@
         <w:jc w:val="left"/>
       </w:pPr>
       <w:r>
-        <w:t>At the bottom of the box, protected inside a little plastic bag, lay the oldest one: a white coffee, one euro forty, a date from many years ago — his first day in Madrid. He had bought it without being able to pay for it, for the sake of sitting somewhere warm that didn't know him. On the back, in pencil, one word: arrived. It was the only receipt in the box that justified no expense. It justified everything else.</w:t>
+        <w:t>At the bottom of the box, protected inside a little plastic bag, lay the oldest one: a white coffee, one euro forty, a date from many years ago—his first day in Madrid. He had bought it without being able to pay for it, for the sake of sitting somewhere warm that didn't know him. On the back, in pencil, one word: arrived. It was the only receipt in the box that justified no expense. It justified everything else.</w:t>
       </w:r>
     </w:p>
     <w:p>

</xml_diff>